<commit_message>
Added card images to the assets and created a default game class which the other game classes will inherit from
</commit_message>
<xml_diff>
--- a/NEA Documentation.docx
+++ b/NEA Documentation.docx
@@ -1,6 +1,6 @@
 
 <file path=word/document.xml><?xml version="1.0" encoding="utf-8"?>
-<w:document xmlns:wpc="http://schemas.microsoft.com/office/word/2010/wordprocessingCanvas" xmlns:cx="http://schemas.microsoft.com/office/drawing/2014/chartex" xmlns:cx1="http://schemas.microsoft.com/office/drawing/2015/9/8/chartex" xmlns:cx2="http://schemas.microsoft.com/office/drawing/2015/10/21/chartex" xmlns:cx3="http://schemas.microsoft.com/office/drawing/2016/5/9/chartex" xmlns:cx4="http://schemas.microsoft.com/office/drawing/2016/5/10/chartex" xmlns:cx5="http://schemas.microsoft.com/office/drawing/2016/5/11/chartex" xmlns:cx6="http://schemas.microsoft.com/office/drawing/2016/5/12/chartex" xmlns:cx7="http://schemas.microsoft.com/office/drawing/2016/5/13/chartex" xmlns:cx8="http://schemas.microsoft.com/office/drawing/2016/5/14/chartex" xmlns:mc="http://schemas.openxmlformats.org/markup-compatibility/2006" xmlns:aink="http://schemas.microsoft.com/office/drawing/2016/ink" xmlns:am3d="http://schemas.microsoft.com/office/drawing/2017/model3d" xmlns:o="urn:schemas-microsoft-com:office:office" xmlns:oel="http://schemas.microsoft.com/office/2019/extlst" xmlns:r="http://schemas.openxmlformats.org/officeDocument/2006/relationships" xmlns:m="http://schemas.openxmlformats.org/officeDocument/2006/math" xmlns:v="urn:schemas-microsoft-com:vml" xmlns:wp14="http://schemas.microsoft.com/office/word/2010/wordprocessingDrawing" xmlns:wp="http://schemas.openxmlformats.org/drawingml/2006/wordprocessingDrawing" xmlns:w10="urn:schemas-microsoft-com:office:word" xmlns:w="http://schemas.openxmlformats.org/wordprocessingml/2006/main" xmlns:w14="http://schemas.microsoft.com/office/word/2010/wordml" xmlns:w15="http://schemas.microsoft.com/office/word/2012/wordml" xmlns:w16cei="http://schemas.microsoft.com/office/word/2026/wordml/cei" xmlns:w16cex="http://schemas.microsoft.com/office/word/2018/wordml/cex" xmlns:w16cid="http://schemas.microsoft.com/office/word/2016/wordml/cid" xmlns:w16="http://schemas.microsoft.com/office/word/2018/wordml" xmlns:w16du="http://schemas.microsoft.com/office/word/2023/wordml/word16du" xmlns:w16sdtdh="http://schemas.microsoft.com/office/word/2020/wordml/sdtdatahash" xmlns:w16sdtfl="http://schemas.microsoft.com/office/word/2024/wordml/sdtformatlock" xmlns:w16se="http://schemas.microsoft.com/office/word/2015/wordml/symex" xmlns:wpg="http://schemas.microsoft.com/office/word/2010/wordprocessingGroup" xmlns:wpi="http://schemas.microsoft.com/office/word/2010/wordprocessingInk" xmlns:wne="http://schemas.microsoft.com/office/word/2006/wordml" xmlns:wps="http://schemas.microsoft.com/office/word/2010/wordprocessingShape" mc:Ignorable="w14 w15 w16se w16cid w16 w16cex w16sdtdh w16sdtfl w16du wp14">
+<w:document xmlns:wpc="http://schemas.microsoft.com/office/word/2010/wordprocessingCanvas" xmlns:cx="http://schemas.microsoft.com/office/drawing/2014/chartex" xmlns:cx1="http://schemas.microsoft.com/office/drawing/2015/9/8/chartex" xmlns:cx2="http://schemas.microsoft.com/office/drawing/2015/10/21/chartex" xmlns:cx3="http://schemas.microsoft.com/office/drawing/2016/5/9/chartex" xmlns:cx4="http://schemas.microsoft.com/office/drawing/2016/5/10/chartex" xmlns:cx5="http://schemas.microsoft.com/office/drawing/2016/5/11/chartex" xmlns:cx6="http://schemas.microsoft.com/office/drawing/2016/5/12/chartex" xmlns:cx7="http://schemas.microsoft.com/office/drawing/2016/5/13/chartex" xmlns:cx8="http://schemas.microsoft.com/office/drawing/2016/5/14/chartex" xmlns:mc="http://schemas.openxmlformats.org/markup-compatibility/2006" xmlns:aink="http://schemas.microsoft.com/office/drawing/2016/ink" xmlns:am3d="http://schemas.microsoft.com/office/drawing/2017/model3d" xmlns:o="urn:schemas-microsoft-com:office:office" xmlns:oel="http://schemas.microsoft.com/office/2019/extlst" xmlns:r="http://schemas.openxmlformats.org/officeDocument/2006/relationships" xmlns:m="http://schemas.openxmlformats.org/officeDocument/2006/math" xmlns:v="urn:schemas-microsoft-com:vml" xmlns:wp14="http://schemas.microsoft.com/office/word/2010/wordprocessingDrawing" xmlns:wp="http://schemas.openxmlformats.org/drawingml/2006/wordprocessingDrawing" xmlns:w10="urn:schemas-microsoft-com:office:word" xmlns:w="http://schemas.openxmlformats.org/wordprocessingml/2006/main" xmlns:w14="http://schemas.microsoft.com/office/word/2010/wordml" xmlns:w15="http://schemas.microsoft.com/office/word/2012/wordml" xmlns:w16cex="http://schemas.microsoft.com/office/word/2018/wordml/cex" xmlns:w16cid="http://schemas.microsoft.com/office/word/2016/wordml/cid" xmlns:w16="http://schemas.microsoft.com/office/word/2018/wordml" xmlns:w16du="http://schemas.microsoft.com/office/word/2023/wordml/word16du" xmlns:w16sdtdh="http://schemas.microsoft.com/office/word/2020/wordml/sdtdatahash" xmlns:w16sdtfl="http://schemas.microsoft.com/office/word/2024/wordml/sdtformatlock" xmlns:w16se="http://schemas.microsoft.com/office/word/2015/wordml/symex" xmlns:wpg="http://schemas.microsoft.com/office/word/2010/wordprocessingGroup" xmlns:wpi="http://schemas.microsoft.com/office/word/2010/wordprocessingInk" xmlns:wne="http://schemas.microsoft.com/office/word/2006/wordml" xmlns:wps="http://schemas.microsoft.com/office/word/2010/wordprocessingShape" mc:Ignorable="w14 w15 w16se w16cid w16 w16cex w16sdtdh w16sdtfl w16du wp14">
   <w:body>
     <w:sdt>
       <w:sdtPr>
@@ -182,7 +182,7 @@
                   </wp:anchor>
                 </w:drawing>
               </mc:Choice>
-              <mc:Fallback>
+              <mc:Fallback xmlns:w16cei="http://schemas.microsoft.com/office/word/2026/wordml/cei">
                 <w:pict>
                   <v:rect w14:anchorId="475988D8" id="Rectangle 16" o:spid="_x0000_s1026" style="position:absolute;margin-left:0;margin-top:0;width:422.3pt;height:760.1pt;z-index:251659264;visibility:visible;mso-wrap-style:square;mso-width-percent:690;mso-height-percent:960;mso-left-percent:20;mso-top-percent:20;mso-wrap-distance-left:9pt;mso-wrap-distance-top:0;mso-wrap-distance-right:9pt;mso-wrap-distance-bottom:0;mso-position-horizontal-relative:page;mso-position-vertical-relative:page;mso-width-percent:690;mso-height-percent:960;mso-left-percent:20;mso-top-percent:20;mso-width-relative:page;mso-height-relative:page;v-text-anchor:middle" o:gfxdata="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" fillcolor="#5b9bd5 [3204]" stroked="f">
                     <v:textbox inset="21.6pt,1in,21.6pt">
@@ -397,7 +397,7 @@
                   </wp:anchor>
                 </w:drawing>
               </mc:Choice>
-              <mc:Fallback>
+              <mc:Fallback xmlns:w16cei="http://schemas.microsoft.com/office/word/2026/wordml/cei">
                 <w:pict>
                   <v:rect w14:anchorId="4716CD8B" id="Rectangle 472" o:spid="_x0000_s1027" style="position:absolute;margin-left:0;margin-top:0;width:148.1pt;height:760.3pt;z-index:251660288;visibility:visible;mso-wrap-style:square;mso-width-percent:242;mso-height-percent:960;mso-left-percent:730;mso-wrap-distance-left:9pt;mso-wrap-distance-top:0;mso-wrap-distance-right:9pt;mso-wrap-distance-bottom:0;mso-position-horizontal-relative:page;mso-position-vertical:center;mso-position-vertical-relative:page;mso-width-percent:242;mso-height-percent:960;mso-left-percent:730;mso-width-relative:page;mso-height-relative:page;v-text-anchor:middle" o:gfxdata="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" fillcolor="#44546a [3215]" stroked="f" strokeweight="1pt">
                     <v:textbox inset="14.4pt,,14.4pt">
@@ -3329,17 +3329,8 @@
           <w:b/>
           <w:bCs/>
         </w:rPr>
-        <w:t xml:space="preserve">To flip </w:t>
-      </w:r>
-      <w:proofErr w:type="gramStart"/>
-      <w:r>
-        <w:rPr>
-          <w:b/>
-          <w:bCs/>
-        </w:rPr>
-        <w:t>sprite :</w:t>
-      </w:r>
-      <w:proofErr w:type="gramEnd"/>
+        <w:t>To flip sprite :</w:t>
+      </w:r>
       <w:r>
         <w:t xml:space="preserve"> </w:t>
       </w:r>
@@ -3362,17 +3353,12 @@
         <w:t xml:space="preserve">of. </w:t>
       </w:r>
       <w:proofErr w:type="spellStart"/>
-      <w:proofErr w:type="gramStart"/>
       <w:r>
         <w:t>setScaleX</w:t>
       </w:r>
       <w:proofErr w:type="spellEnd"/>
       <w:r>
-        <w:t>(</w:t>
-      </w:r>
-      <w:proofErr w:type="gramEnd"/>
-      <w:r>
-        <w:t>) to -1 or 1 to flip the sprite when it moves left or right.</w:t>
+        <w:t>() to -1 or 1 to flip the sprite when it moves left or right.</w:t>
       </w:r>
     </w:p>
     <w:p/>
@@ -3426,13 +3412,39 @@
           <w:bCs/>
         </w:rPr>
       </w:pPr>
+      <w:r>
+        <w:rPr>
+          <w:b/>
+          <w:bCs/>
+        </w:rPr>
+        <w:lastRenderedPageBreak/>
+        <w:t>Link for programming blackjack game:</w:t>
+      </w:r>
+    </w:p>
+    <w:p/>
+    <w:p>
+      <w:r>
+        <w:t>Card Pack downloaded:</w:t>
+      </w:r>
+    </w:p>
+    <w:p>
+      <w:r>
+        <w:t>https://kerenel.itch.io/pixelart-cards</w:t>
+      </w:r>
+    </w:p>
+    <w:p>
+      <w:pPr>
+        <w:rPr>
+          <w:b/>
+          <w:bCs/>
+        </w:rPr>
+      </w:pPr>
       <w:proofErr w:type="spellStart"/>
       <w:r>
         <w:rPr>
           <w:b/>
           <w:bCs/>
         </w:rPr>
-        <w:lastRenderedPageBreak/>
         <w:t>Tilemap</w:t>
       </w:r>
       <w:proofErr w:type="spellEnd"/>
@@ -3698,27 +3710,7 @@
           <w:bCs/>
           <w:color w:val="auto"/>
         </w:rPr>
-        <w:t xml:space="preserve">1.6.3 Identification of objects and </w:t>
-      </w:r>
-      <w:proofErr w:type="gramStart"/>
-      <w:r>
-        <w:rPr>
-          <w:rFonts w:ascii="Arial" w:hAnsi="Arial" w:cs="Arial"/>
-          <w:b/>
-          <w:bCs/>
-          <w:color w:val="auto"/>
-        </w:rPr>
-        <w:t>object</w:t>
-      </w:r>
-      <w:proofErr w:type="gramEnd"/>
-      <w:r>
-        <w:rPr>
-          <w:rFonts w:ascii="Arial" w:hAnsi="Arial" w:cs="Arial"/>
-          <w:b/>
-          <w:bCs/>
-          <w:color w:val="auto"/>
-        </w:rPr>
-        <w:t>–analysis diagrams</w:t>
+        <w:t>1.6.3 Identification of objects and object–analysis diagrams</w:t>
       </w:r>
       <w:bookmarkEnd w:id="12"/>
       <w:r>
@@ -4023,6 +4015,7 @@
         <w:rPr>
           <w:noProof/>
         </w:rPr>
+        <w:lastRenderedPageBreak/>
         <w:drawing>
           <wp:inline distT="0" distB="0" distL="0" distR="0" wp14:anchorId="4FB06110" wp14:editId="226BDA2E">
             <wp:extent cx="5789295" cy="479425"/>
@@ -4093,7 +4086,6 @@
         <w:rPr>
           <w:noProof/>
         </w:rPr>
-        <w:lastRenderedPageBreak/>
         <w:drawing>
           <wp:inline distT="0" distB="0" distL="0" distR="0" wp14:anchorId="4C406194" wp14:editId="5EAA0940">
             <wp:extent cx="2956816" cy="883997"/>
@@ -4151,30 +4143,20 @@
         <w:t xml:space="preserve">, which execute the functions </w:t>
       </w:r>
       <w:proofErr w:type="spellStart"/>
-      <w:proofErr w:type="gramStart"/>
       <w:r>
         <w:t>keyPressed</w:t>
       </w:r>
       <w:proofErr w:type="spellEnd"/>
       <w:r>
-        <w:t>(</w:t>
-      </w:r>
-      <w:proofErr w:type="gramEnd"/>
-      <w:r>
-        <w:t xml:space="preserve">) and </w:t>
+        <w:t xml:space="preserve">() and </w:t>
       </w:r>
       <w:proofErr w:type="spellStart"/>
-      <w:proofErr w:type="gramStart"/>
       <w:r>
         <w:t>keyReleased</w:t>
       </w:r>
       <w:proofErr w:type="spellEnd"/>
       <w:r>
-        <w:t>(</w:t>
-      </w:r>
-      <w:proofErr w:type="gramEnd"/>
-      <w:r>
-        <w:t>).</w:t>
+        <w:t>().</w:t>
       </w:r>
     </w:p>
     <w:p>
@@ -4236,46 +4218,31 @@
         <w:t xml:space="preserve">The functions </w:t>
       </w:r>
       <w:proofErr w:type="spellStart"/>
-      <w:proofErr w:type="gramStart"/>
       <w:r>
         <w:t>keyPressed</w:t>
       </w:r>
       <w:proofErr w:type="spellEnd"/>
       <w:r>
-        <w:t>(</w:t>
-      </w:r>
-      <w:proofErr w:type="gramEnd"/>
-      <w:r>
-        <w:t xml:space="preserve">) and </w:t>
+        <w:t xml:space="preserve">() and </w:t>
       </w:r>
       <w:proofErr w:type="spellStart"/>
-      <w:proofErr w:type="gramStart"/>
       <w:r>
         <w:t>keyReleased</w:t>
       </w:r>
       <w:proofErr w:type="spellEnd"/>
       <w:r>
-        <w:t>(</w:t>
-      </w:r>
-      <w:proofErr w:type="gramEnd"/>
-      <w:r>
-        <w:t>) detect which key is being released, and adjust the</w:t>
+        <w:t>() detect which key is being released, and adjust the</w:t>
       </w:r>
       <w:r>
         <w:t xml:space="preserve"> Booleans above based on </w:t>
       </w:r>
       <w:proofErr w:type="spellStart"/>
-      <w:proofErr w:type="gramStart"/>
       <w:r>
         <w:t>KeyEvent</w:t>
       </w:r>
       <w:proofErr w:type="spellEnd"/>
       <w:r>
-        <w:t>(</w:t>
-      </w:r>
-      <w:proofErr w:type="gramEnd"/>
-      <w:r>
-        <w:t>) that is passed.</w:t>
+        <w:t>() that is passed.</w:t>
       </w:r>
     </w:p>
     <w:p>
@@ -4337,6 +4304,7 @@
         <w:rPr>
           <w:noProof/>
         </w:rPr>
+        <w:lastRenderedPageBreak/>
         <w:drawing>
           <wp:inline distT="0" distB="0" distL="0" distR="0" wp14:anchorId="112BCF3B" wp14:editId="1352A5E7">
             <wp:extent cx="3914775" cy="2789098"/>
@@ -4385,7 +4353,6 @@
         <w:jc w:val="both"/>
       </w:pPr>
       <w:r>
-        <w:lastRenderedPageBreak/>
         <w:t>Then I went to the game class and created an object called player.</w:t>
       </w:r>
       <w:r>
@@ -4404,17 +4371,12 @@
         <w:t xml:space="preserve"> timer I called a function called </w:t>
       </w:r>
       <w:proofErr w:type="spellStart"/>
-      <w:proofErr w:type="gramStart"/>
       <w:r>
         <w:t>updatePlayer</w:t>
       </w:r>
       <w:proofErr w:type="spellEnd"/>
       <w:r>
-        <w:t>(</w:t>
-      </w:r>
-      <w:proofErr w:type="gramEnd"/>
-      <w:r>
-        <w:t>)</w:t>
+        <w:t>()</w:t>
       </w:r>
       <w:r>
         <w:t xml:space="preserve"> (located in the player class)</w:t>
@@ -4426,30 +4388,20 @@
         <w:t xml:space="preserve">I called the function </w:t>
       </w:r>
       <w:proofErr w:type="spellStart"/>
-      <w:proofErr w:type="gramStart"/>
       <w:r>
         <w:t>movePlayer</w:t>
       </w:r>
       <w:proofErr w:type="spellEnd"/>
       <w:r>
-        <w:t>(</w:t>
-      </w:r>
-      <w:proofErr w:type="gramEnd"/>
-      <w:r>
-        <w:t xml:space="preserve">) to move the player around the map. I will also add another function in </w:t>
+        <w:t xml:space="preserve">() to move the player around the map. I will also add another function in </w:t>
       </w:r>
       <w:proofErr w:type="spellStart"/>
-      <w:proofErr w:type="gramStart"/>
       <w:r>
         <w:t>updatePlayer</w:t>
       </w:r>
       <w:proofErr w:type="spellEnd"/>
       <w:r>
-        <w:t>(</w:t>
-      </w:r>
-      <w:proofErr w:type="gramEnd"/>
-      <w:r>
-        <w:t>) for collision</w:t>
+        <w:t>() for collision</w:t>
       </w:r>
       <w:r>
         <w:t xml:space="preserve"> detection</w:t>
@@ -4517,6 +4469,7 @@
         <w:rPr>
           <w:noProof/>
         </w:rPr>
+        <w:lastRenderedPageBreak/>
         <w:drawing>
           <wp:inline distT="0" distB="0" distL="0" distR="0" wp14:anchorId="0DC7EB85" wp14:editId="15D7CB50">
             <wp:extent cx="4343400" cy="4508713"/>
@@ -4573,7 +4526,6 @@
           <w:b/>
           <w:bCs/>
         </w:rPr>
-        <w:lastRenderedPageBreak/>
         <w:t>Background</w:t>
       </w:r>
     </w:p>
@@ -4594,6 +4546,7 @@
           <w:sz w:val="22"/>
           <w:szCs w:val="22"/>
         </w:rPr>
+        <w:lastRenderedPageBreak/>
         <w:t>After creating a moving sprite I moved onto the background</w:t>
       </w:r>
       <w:r>
@@ -4621,9 +4574,8 @@
           <w:sz w:val="22"/>
           <w:szCs w:val="22"/>
         </w:rPr>
-        <w:t xml:space="preserve"> </w:t>
-      </w:r>
-      <w:proofErr w:type="gramStart"/>
+        <w:t xml:space="preserve"> Canvas  c</w:t>
+      </w:r>
       <w:r>
         <w:rPr>
           <w:rFonts w:ascii="Arial" w:hAnsi="Arial" w:cs="Arial"/>
@@ -4631,7 +4583,7 @@
           <w:sz w:val="22"/>
           <w:szCs w:val="22"/>
         </w:rPr>
-        <w:t>Canvas  c</w:t>
+        <w:t>lass to draw this out</w:t>
       </w:r>
       <w:r>
         <w:rPr>
@@ -4640,46 +4592,7 @@
           <w:sz w:val="22"/>
           <w:szCs w:val="22"/>
         </w:rPr>
-        <w:t>lass</w:t>
-      </w:r>
-      <w:proofErr w:type="gramEnd"/>
-      <w:r>
-        <w:rPr>
-          <w:rFonts w:ascii="Arial" w:hAnsi="Arial" w:cs="Arial"/>
-          <w:color w:val="auto"/>
-          <w:sz w:val="22"/>
-          <w:szCs w:val="22"/>
-        </w:rPr>
-        <w:t xml:space="preserve"> to draw this out</w:t>
-      </w:r>
-      <w:r>
-        <w:rPr>
-          <w:rFonts w:ascii="Arial" w:hAnsi="Arial" w:cs="Arial"/>
-          <w:color w:val="auto"/>
-          <w:sz w:val="22"/>
-          <w:szCs w:val="22"/>
-        </w:rPr>
-        <w:t xml:space="preserve">. </w:t>
-      </w:r>
-      <w:proofErr w:type="gramStart"/>
-      <w:r>
-        <w:rPr>
-          <w:rFonts w:ascii="Arial" w:hAnsi="Arial" w:cs="Arial"/>
-          <w:color w:val="auto"/>
-          <w:sz w:val="22"/>
-          <w:szCs w:val="22"/>
-        </w:rPr>
-        <w:t>First</w:t>
-      </w:r>
-      <w:proofErr w:type="gramEnd"/>
-      <w:r>
-        <w:rPr>
-          <w:rFonts w:ascii="Arial" w:hAnsi="Arial" w:cs="Arial"/>
-          <w:color w:val="auto"/>
-          <w:sz w:val="22"/>
-          <w:szCs w:val="22"/>
-        </w:rPr>
-        <w:t xml:space="preserve"> I stored a </w:t>
+        <w:t xml:space="preserve">. First I stored a </w:t>
       </w:r>
       <w:r>
         <w:rPr>
@@ -4811,7 +4724,6 @@
         <w:t xml:space="preserve">After this I created a function </w:t>
       </w:r>
       <w:proofErr w:type="spellStart"/>
-      <w:proofErr w:type="gramStart"/>
       <w:r>
         <w:rPr>
           <w:szCs w:val="22"/>
@@ -4823,55 +4735,40 @@
         <w:rPr>
           <w:szCs w:val="22"/>
         </w:rPr>
-        <w:t>(</w:t>
-      </w:r>
-      <w:proofErr w:type="gramEnd"/>
+        <w:t xml:space="preserve">() </w:t>
+      </w:r>
       <w:r>
         <w:rPr>
           <w:szCs w:val="22"/>
         </w:rPr>
-        <w:t xml:space="preserve">) </w:t>
-      </w:r>
+        <w:t xml:space="preserve">to render only the tiles which will be shown on the </w:t>
+      </w:r>
+      <w:bookmarkStart w:id="21" w:name="_Toc234311115"/>
       <w:r>
         <w:rPr>
           <w:szCs w:val="22"/>
         </w:rPr>
-        <w:t xml:space="preserve">to render only the tiles which will be shown on the </w:t>
-      </w:r>
-      <w:bookmarkStart w:id="21" w:name="_Toc234311115"/>
+        <w:t xml:space="preserve">scene of the </w:t>
+      </w:r>
       <w:r>
         <w:rPr>
           <w:szCs w:val="22"/>
         </w:rPr>
-        <w:t xml:space="preserve">scene of the </w:t>
-      </w:r>
+        <w:t xml:space="preserve">game, with a separate function </w:t>
+      </w:r>
+      <w:proofErr w:type="spellStart"/>
       <w:r>
         <w:rPr>
           <w:szCs w:val="22"/>
         </w:rPr>
-        <w:t xml:space="preserve">game, with a separate function </w:t>
-      </w:r>
-      <w:proofErr w:type="spellStart"/>
-      <w:proofErr w:type="gramStart"/>
+        <w:t>drawTile</w:t>
+      </w:r>
+      <w:proofErr w:type="spellEnd"/>
       <w:r>
         <w:rPr>
           <w:szCs w:val="22"/>
         </w:rPr>
-        <w:t>drawTile</w:t>
-      </w:r>
-      <w:proofErr w:type="spellEnd"/>
-      <w:r>
-        <w:rPr>
-          <w:szCs w:val="22"/>
-        </w:rPr>
-        <w:t>(</w:t>
-      </w:r>
-      <w:proofErr w:type="gramEnd"/>
-      <w:r>
-        <w:rPr>
-          <w:szCs w:val="22"/>
-        </w:rPr>
-        <w:t>) used to draw each individual tile using switch cases.</w:t>
+        <w:t>() used to draw each individual tile using switch cases.</w:t>
       </w:r>
     </w:p>
     <w:p>
@@ -4925,18 +4822,18 @@
     </w:p>
     <w:p>
       <w:r>
+        <w:t xml:space="preserve">The canvas and graphics context are created </w:t>
+      </w:r>
+      <w:r>
+        <w:t>in the main method of the class.</w:t>
+      </w:r>
+    </w:p>
+    <w:p>
+      <w:r>
+        <w:rPr>
+          <w:noProof/>
+        </w:rPr>
         <w:lastRenderedPageBreak/>
-        <w:t xml:space="preserve">The canvas and graphics context are created </w:t>
-      </w:r>
-      <w:r>
-        <w:t>in the main method of the class.</w:t>
-      </w:r>
-    </w:p>
-    <w:p>
-      <w:r>
-        <w:rPr>
-          <w:noProof/>
-        </w:rPr>
         <w:drawing>
           <wp:inline distT="0" distB="0" distL="0" distR="0" wp14:anchorId="12470157" wp14:editId="6D69CCFA">
             <wp:extent cx="4353533" cy="2381582"/>
@@ -5079,12 +4976,10 @@
         <w:t xml:space="preserve"> and </w:t>
       </w:r>
       <w:proofErr w:type="spellStart"/>
-      <w:proofErr w:type="gramStart"/>
       <w:r>
         <w:t>player.y</w:t>
       </w:r>
       <w:proofErr w:type="spellEnd"/>
-      <w:proofErr w:type="gramEnd"/>
       <w:r>
         <w:t xml:space="preserve"> to </w:t>
       </w:r>
@@ -5174,11 +5069,14 @@
     </w:p>
     <w:p>
       <w:r>
+        <w:t>To do this I first c</w:t>
+      </w:r>
+      <w:r>
+        <w:t xml:space="preserve">reated a camera in the game class which is calculated based on the sprite’s position relative to the map (at half the stages dimensions). Then I adjusted the rendering </w:t>
+      </w:r>
+      <w:r>
         <w:lastRenderedPageBreak/>
-        <w:t>To do this I first c</w:t>
-      </w:r>
-      <w:r>
-        <w:t>reated a camera in the game class which is calculated based on the sprite’s position relative to the map (at half the stages dimensions). Then I adjusted the rendering function in the background class to draw the map from the appropriate starting coordinates given by the camera. The player’s position is then updated relative to the camera and stage.</w:t>
+        <w:t>function in the background class to draw the map from the appropriate starting coordinates given by the camera. The player’s position is then updated relative to the camera and stage.</w:t>
       </w:r>
     </w:p>
     <w:p>
@@ -5187,7 +5085,7 @@
           <w:noProof/>
         </w:rPr>
         <w:drawing>
-          <wp:inline distT="0" distB="0" distL="0" distR="0" wp14:anchorId="226F89C5" wp14:editId="3DFFB7B8">
+          <wp:inline distT="0" distB="0" distL="0" distR="0" wp14:anchorId="226F89C5" wp14:editId="274337F2">
             <wp:extent cx="5789295" cy="1595120"/>
             <wp:effectExtent l="0" t="0" r="1905" b="5080"/>
             <wp:docPr id="542006062" name="Picture 3"/>
@@ -5307,7 +5205,7 @@
           <w:noProof/>
         </w:rPr>
         <w:drawing>
-          <wp:inline distT="0" distB="0" distL="0" distR="0" wp14:anchorId="1A9EABE6" wp14:editId="3D7B4B2C">
+          <wp:inline distT="0" distB="0" distL="0" distR="0" wp14:anchorId="1A9EABE6" wp14:editId="5F7F072D">
             <wp:extent cx="5789295" cy="1915795"/>
             <wp:effectExtent l="0" t="0" r="1905" b="8255"/>
             <wp:docPr id="184673664" name="Picture 3"/>
@@ -5361,21 +5259,19 @@
           <w:b/>
           <w:bCs/>
         </w:rPr>
+        <w:t>Scene switching</w:t>
+      </w:r>
+    </w:p>
+    <w:p>
+      <w:r>
         <w:lastRenderedPageBreak/>
-        <w:t>Scene switching</w:t>
-      </w:r>
-    </w:p>
-    <w:p>
-      <w:r>
-        <w:t xml:space="preserve">At this </w:t>
-      </w:r>
-      <w:proofErr w:type="gramStart"/>
-      <w:r>
-        <w:t>time</w:t>
-      </w:r>
-      <w:proofErr w:type="gramEnd"/>
-      <w:r>
-        <w:t xml:space="preserve"> I decided to create a function to switch scenes throughout the game. I created this in the Main class</w:t>
+        <w:t xml:space="preserve">At this time I </w:t>
+      </w:r>
+      <w:r>
+        <w:t xml:space="preserve">also </w:t>
+      </w:r>
+      <w:r>
+        <w:t>decided to create a function to switch scenes throughout the game. I created this in the Main class</w:t>
       </w:r>
     </w:p>
     <w:p>
@@ -5706,7 +5602,7 @@
 </file>
 
 <file path=word/endnotes.xml><?xml version="1.0" encoding="utf-8"?>
-<w:endnotes xmlns:wpc="http://schemas.microsoft.com/office/word/2010/wordprocessingCanvas" xmlns:cx="http://schemas.microsoft.com/office/drawing/2014/chartex" xmlns:cx1="http://schemas.microsoft.com/office/drawing/2015/9/8/chartex" xmlns:cx2="http://schemas.microsoft.com/office/drawing/2015/10/21/chartex" xmlns:cx3="http://schemas.microsoft.com/office/drawing/2016/5/9/chartex" xmlns:cx4="http://schemas.microsoft.com/office/drawing/2016/5/10/chartex" xmlns:cx5="http://schemas.microsoft.com/office/drawing/2016/5/11/chartex" xmlns:cx6="http://schemas.microsoft.com/office/drawing/2016/5/12/chartex" xmlns:cx7="http://schemas.microsoft.com/office/drawing/2016/5/13/chartex" xmlns:cx8="http://schemas.microsoft.com/office/drawing/2016/5/14/chartex" xmlns:mc="http://schemas.openxmlformats.org/markup-compatibility/2006" xmlns:aink="http://schemas.microsoft.com/office/drawing/2016/ink" xmlns:am3d="http://schemas.microsoft.com/office/drawing/2017/model3d" xmlns:o="urn:schemas-microsoft-com:office:office" xmlns:oel="http://schemas.microsoft.com/office/2019/extlst" xmlns:r="http://schemas.openxmlformats.org/officeDocument/2006/relationships" xmlns:m="http://schemas.openxmlformats.org/officeDocument/2006/math" xmlns:v="urn:schemas-microsoft-com:vml" xmlns:wp14="http://schemas.microsoft.com/office/word/2010/wordprocessingDrawing" xmlns:wp="http://schemas.openxmlformats.org/drawingml/2006/wordprocessingDrawing" xmlns:w10="urn:schemas-microsoft-com:office:word" xmlns:w="http://schemas.openxmlformats.org/wordprocessingml/2006/main" xmlns:w14="http://schemas.microsoft.com/office/word/2010/wordml" xmlns:w15="http://schemas.microsoft.com/office/word/2012/wordml" xmlns:w16cei="http://schemas.microsoft.com/office/word/2026/wordml/cei" xmlns:w16cex="http://schemas.microsoft.com/office/word/2018/wordml/cex" xmlns:w16cid="http://schemas.microsoft.com/office/word/2016/wordml/cid" xmlns:w16="http://schemas.microsoft.com/office/word/2018/wordml" xmlns:w16du="http://schemas.microsoft.com/office/word/2023/wordml/word16du" xmlns:w16sdtdh="http://schemas.microsoft.com/office/word/2020/wordml/sdtdatahash" xmlns:w16sdtfl="http://schemas.microsoft.com/office/word/2024/wordml/sdtformatlock" xmlns:w16se="http://schemas.microsoft.com/office/word/2015/wordml/symex" xmlns:wpg="http://schemas.microsoft.com/office/word/2010/wordprocessingGroup" xmlns:wpi="http://schemas.microsoft.com/office/word/2010/wordprocessingInk" xmlns:wne="http://schemas.microsoft.com/office/word/2006/wordml" xmlns:wps="http://schemas.microsoft.com/office/word/2010/wordprocessingShape" mc:Ignorable="w14 w15 w16se w16cid w16 w16cex w16sdtdh w16sdtfl w16du wp14">
+<w:endnotes xmlns:wpc="http://schemas.microsoft.com/office/word/2010/wordprocessingCanvas" xmlns:cx="http://schemas.microsoft.com/office/drawing/2014/chartex" xmlns:cx1="http://schemas.microsoft.com/office/drawing/2015/9/8/chartex" xmlns:cx2="http://schemas.microsoft.com/office/drawing/2015/10/21/chartex" xmlns:cx3="http://schemas.microsoft.com/office/drawing/2016/5/9/chartex" xmlns:cx4="http://schemas.microsoft.com/office/drawing/2016/5/10/chartex" xmlns:cx5="http://schemas.microsoft.com/office/drawing/2016/5/11/chartex" xmlns:cx6="http://schemas.microsoft.com/office/drawing/2016/5/12/chartex" xmlns:cx7="http://schemas.microsoft.com/office/drawing/2016/5/13/chartex" xmlns:cx8="http://schemas.microsoft.com/office/drawing/2016/5/14/chartex" xmlns:mc="http://schemas.openxmlformats.org/markup-compatibility/2006" xmlns:aink="http://schemas.microsoft.com/office/drawing/2016/ink" xmlns:am3d="http://schemas.microsoft.com/office/drawing/2017/model3d" xmlns:o="urn:schemas-microsoft-com:office:office" xmlns:oel="http://schemas.microsoft.com/office/2019/extlst" xmlns:r="http://schemas.openxmlformats.org/officeDocument/2006/relationships" xmlns:m="http://schemas.openxmlformats.org/officeDocument/2006/math" xmlns:v="urn:schemas-microsoft-com:vml" xmlns:wp14="http://schemas.microsoft.com/office/word/2010/wordprocessingDrawing" xmlns:wp="http://schemas.openxmlformats.org/drawingml/2006/wordprocessingDrawing" xmlns:w10="urn:schemas-microsoft-com:office:word" xmlns:w="http://schemas.openxmlformats.org/wordprocessingml/2006/main" xmlns:w14="http://schemas.microsoft.com/office/word/2010/wordml" xmlns:w15="http://schemas.microsoft.com/office/word/2012/wordml" xmlns:w16cex="http://schemas.microsoft.com/office/word/2018/wordml/cex" xmlns:w16cid="http://schemas.microsoft.com/office/word/2016/wordml/cid" xmlns:w16="http://schemas.microsoft.com/office/word/2018/wordml" xmlns:w16du="http://schemas.microsoft.com/office/word/2023/wordml/word16du" xmlns:w16sdtdh="http://schemas.microsoft.com/office/word/2020/wordml/sdtdatahash" xmlns:w16sdtfl="http://schemas.microsoft.com/office/word/2024/wordml/sdtformatlock" xmlns:w16se="http://schemas.microsoft.com/office/word/2015/wordml/symex" xmlns:wpg="http://schemas.microsoft.com/office/word/2010/wordprocessingGroup" xmlns:wpi="http://schemas.microsoft.com/office/word/2010/wordprocessingInk" xmlns:wne="http://schemas.microsoft.com/office/word/2006/wordml" xmlns:wps="http://schemas.microsoft.com/office/word/2010/wordprocessingShape" mc:Ignorable="w14 w15 w16se w16cid w16 w16cex w16sdtdh w16sdtfl w16du wp14">
   <w:endnote w:type="separator" w:id="-1">
     <w:p>
       <w:pPr>
@@ -5731,7 +5627,7 @@
 </file>
 
 <file path=word/footer1.xml><?xml version="1.0" encoding="utf-8"?>
-<w:ftr xmlns:wpc="http://schemas.microsoft.com/office/word/2010/wordprocessingCanvas" xmlns:cx="http://schemas.microsoft.com/office/drawing/2014/chartex" xmlns:cx1="http://schemas.microsoft.com/office/drawing/2015/9/8/chartex" xmlns:cx2="http://schemas.microsoft.com/office/drawing/2015/10/21/chartex" xmlns:cx3="http://schemas.microsoft.com/office/drawing/2016/5/9/chartex" xmlns:cx4="http://schemas.microsoft.com/office/drawing/2016/5/10/chartex" xmlns:cx5="http://schemas.microsoft.com/office/drawing/2016/5/11/chartex" xmlns:cx6="http://schemas.microsoft.com/office/drawing/2016/5/12/chartex" xmlns:cx7="http://schemas.microsoft.com/office/drawing/2016/5/13/chartex" xmlns:cx8="http://schemas.microsoft.com/office/drawing/2016/5/14/chartex" xmlns:mc="http://schemas.openxmlformats.org/markup-compatibility/2006" xmlns:aink="http://schemas.microsoft.com/office/drawing/2016/ink" xmlns:am3d="http://schemas.microsoft.com/office/drawing/2017/model3d" xmlns:o="urn:schemas-microsoft-com:office:office" xmlns:oel="http://schemas.microsoft.com/office/2019/extlst" xmlns:r="http://schemas.openxmlformats.org/officeDocument/2006/relationships" xmlns:m="http://schemas.openxmlformats.org/officeDocument/2006/math" xmlns:v="urn:schemas-microsoft-com:vml" xmlns:wp14="http://schemas.microsoft.com/office/word/2010/wordprocessingDrawing" xmlns:wp="http://schemas.openxmlformats.org/drawingml/2006/wordprocessingDrawing" xmlns:w10="urn:schemas-microsoft-com:office:word" xmlns:w="http://schemas.openxmlformats.org/wordprocessingml/2006/main" xmlns:w14="http://schemas.microsoft.com/office/word/2010/wordml" xmlns:w15="http://schemas.microsoft.com/office/word/2012/wordml" xmlns:w16cei="http://schemas.microsoft.com/office/word/2026/wordml/cei" xmlns:w16cex="http://schemas.microsoft.com/office/word/2018/wordml/cex" xmlns:w16cid="http://schemas.microsoft.com/office/word/2016/wordml/cid" xmlns:w16="http://schemas.microsoft.com/office/word/2018/wordml" xmlns:w16du="http://schemas.microsoft.com/office/word/2023/wordml/word16du" xmlns:w16sdtdh="http://schemas.microsoft.com/office/word/2020/wordml/sdtdatahash" xmlns:w16sdtfl="http://schemas.microsoft.com/office/word/2024/wordml/sdtformatlock" xmlns:w16se="http://schemas.microsoft.com/office/word/2015/wordml/symex" xmlns:wpg="http://schemas.microsoft.com/office/word/2010/wordprocessingGroup" xmlns:wpi="http://schemas.microsoft.com/office/word/2010/wordprocessingInk" xmlns:wne="http://schemas.microsoft.com/office/word/2006/wordml" xmlns:wps="http://schemas.microsoft.com/office/word/2010/wordprocessingShape" mc:Ignorable="w14 w15 w16se w16cid w16 w16cex w16sdtdh w16sdtfl w16du wp14">
+<w:ftr xmlns:wpc="http://schemas.microsoft.com/office/word/2010/wordprocessingCanvas" xmlns:cx="http://schemas.microsoft.com/office/drawing/2014/chartex" xmlns:cx1="http://schemas.microsoft.com/office/drawing/2015/9/8/chartex" xmlns:cx2="http://schemas.microsoft.com/office/drawing/2015/10/21/chartex" xmlns:cx3="http://schemas.microsoft.com/office/drawing/2016/5/9/chartex" xmlns:cx4="http://schemas.microsoft.com/office/drawing/2016/5/10/chartex" xmlns:cx5="http://schemas.microsoft.com/office/drawing/2016/5/11/chartex" xmlns:cx6="http://schemas.microsoft.com/office/drawing/2016/5/12/chartex" xmlns:cx7="http://schemas.microsoft.com/office/drawing/2016/5/13/chartex" xmlns:cx8="http://schemas.microsoft.com/office/drawing/2016/5/14/chartex" xmlns:mc="http://schemas.openxmlformats.org/markup-compatibility/2006" xmlns:aink="http://schemas.microsoft.com/office/drawing/2016/ink" xmlns:am3d="http://schemas.microsoft.com/office/drawing/2017/model3d" xmlns:o="urn:schemas-microsoft-com:office:office" xmlns:oel="http://schemas.microsoft.com/office/2019/extlst" xmlns:r="http://schemas.openxmlformats.org/officeDocument/2006/relationships" xmlns:m="http://schemas.openxmlformats.org/officeDocument/2006/math" xmlns:v="urn:schemas-microsoft-com:vml" xmlns:wp14="http://schemas.microsoft.com/office/word/2010/wordprocessingDrawing" xmlns:wp="http://schemas.openxmlformats.org/drawingml/2006/wordprocessingDrawing" xmlns:w10="urn:schemas-microsoft-com:office:word" xmlns:w="http://schemas.openxmlformats.org/wordprocessingml/2006/main" xmlns:w14="http://schemas.microsoft.com/office/word/2010/wordml" xmlns:w15="http://schemas.microsoft.com/office/word/2012/wordml" xmlns:w16cex="http://schemas.microsoft.com/office/word/2018/wordml/cex" xmlns:w16cid="http://schemas.microsoft.com/office/word/2016/wordml/cid" xmlns:w16="http://schemas.microsoft.com/office/word/2018/wordml" xmlns:w16du="http://schemas.microsoft.com/office/word/2023/wordml/word16du" xmlns:w16sdtdh="http://schemas.microsoft.com/office/word/2020/wordml/sdtdatahash" xmlns:w16sdtfl="http://schemas.microsoft.com/office/word/2024/wordml/sdtformatlock" xmlns:w16se="http://schemas.microsoft.com/office/word/2015/wordml/symex" xmlns:wpg="http://schemas.microsoft.com/office/word/2010/wordprocessingGroup" xmlns:wpi="http://schemas.microsoft.com/office/word/2010/wordprocessingInk" xmlns:wne="http://schemas.microsoft.com/office/word/2006/wordml" xmlns:wps="http://schemas.microsoft.com/office/word/2010/wordprocessingShape" mc:Ignorable="w14 w15 w16se w16cid w16 w16cex w16sdtdh w16sdtfl w16du wp14">
   <w:sdt>
     <w:sdtPr>
       <w:id w:val="1765954373"/>
@@ -5792,7 +5688,7 @@
 </file>
 
 <file path=word/footnotes.xml><?xml version="1.0" encoding="utf-8"?>
-<w:footnotes xmlns:wpc="http://schemas.microsoft.com/office/word/2010/wordprocessingCanvas" xmlns:cx="http://schemas.microsoft.com/office/drawing/2014/chartex" xmlns:cx1="http://schemas.microsoft.com/office/drawing/2015/9/8/chartex" xmlns:cx2="http://schemas.microsoft.com/office/drawing/2015/10/21/chartex" xmlns:cx3="http://schemas.microsoft.com/office/drawing/2016/5/9/chartex" xmlns:cx4="http://schemas.microsoft.com/office/drawing/2016/5/10/chartex" xmlns:cx5="http://schemas.microsoft.com/office/drawing/2016/5/11/chartex" xmlns:cx6="http://schemas.microsoft.com/office/drawing/2016/5/12/chartex" xmlns:cx7="http://schemas.microsoft.com/office/drawing/2016/5/13/chartex" xmlns:cx8="http://schemas.microsoft.com/office/drawing/2016/5/14/chartex" xmlns:mc="http://schemas.openxmlformats.org/markup-compatibility/2006" xmlns:aink="http://schemas.microsoft.com/office/drawing/2016/ink" xmlns:am3d="http://schemas.microsoft.com/office/drawing/2017/model3d" xmlns:o="urn:schemas-microsoft-com:office:office" xmlns:oel="http://schemas.microsoft.com/office/2019/extlst" xmlns:r="http://schemas.openxmlformats.org/officeDocument/2006/relationships" xmlns:m="http://schemas.openxmlformats.org/officeDocument/2006/math" xmlns:v="urn:schemas-microsoft-com:vml" xmlns:wp14="http://schemas.microsoft.com/office/word/2010/wordprocessingDrawing" xmlns:wp="http://schemas.openxmlformats.org/drawingml/2006/wordprocessingDrawing" xmlns:w10="urn:schemas-microsoft-com:office:word" xmlns:w="http://schemas.openxmlformats.org/wordprocessingml/2006/main" xmlns:w14="http://schemas.microsoft.com/office/word/2010/wordml" xmlns:w15="http://schemas.microsoft.com/office/word/2012/wordml" xmlns:w16cei="http://schemas.microsoft.com/office/word/2026/wordml/cei" xmlns:w16cex="http://schemas.microsoft.com/office/word/2018/wordml/cex" xmlns:w16cid="http://schemas.microsoft.com/office/word/2016/wordml/cid" xmlns:w16="http://schemas.microsoft.com/office/word/2018/wordml" xmlns:w16du="http://schemas.microsoft.com/office/word/2023/wordml/word16du" xmlns:w16sdtdh="http://schemas.microsoft.com/office/word/2020/wordml/sdtdatahash" xmlns:w16sdtfl="http://schemas.microsoft.com/office/word/2024/wordml/sdtformatlock" xmlns:w16se="http://schemas.microsoft.com/office/word/2015/wordml/symex" xmlns:wpg="http://schemas.microsoft.com/office/word/2010/wordprocessingGroup" xmlns:wpi="http://schemas.microsoft.com/office/word/2010/wordprocessingInk" xmlns:wne="http://schemas.microsoft.com/office/word/2006/wordml" xmlns:wps="http://schemas.microsoft.com/office/word/2010/wordprocessingShape" mc:Ignorable="w14 w15 w16se w16cid w16 w16cex w16sdtdh w16sdtfl w16du wp14">
+<w:footnotes xmlns:wpc="http://schemas.microsoft.com/office/word/2010/wordprocessingCanvas" xmlns:cx="http://schemas.microsoft.com/office/drawing/2014/chartex" xmlns:cx1="http://schemas.microsoft.com/office/drawing/2015/9/8/chartex" xmlns:cx2="http://schemas.microsoft.com/office/drawing/2015/10/21/chartex" xmlns:cx3="http://schemas.microsoft.com/office/drawing/2016/5/9/chartex" xmlns:cx4="http://schemas.microsoft.com/office/drawing/2016/5/10/chartex" xmlns:cx5="http://schemas.microsoft.com/office/drawing/2016/5/11/chartex" xmlns:cx6="http://schemas.microsoft.com/office/drawing/2016/5/12/chartex" xmlns:cx7="http://schemas.microsoft.com/office/drawing/2016/5/13/chartex" xmlns:cx8="http://schemas.microsoft.com/office/drawing/2016/5/14/chartex" xmlns:mc="http://schemas.openxmlformats.org/markup-compatibility/2006" xmlns:aink="http://schemas.microsoft.com/office/drawing/2016/ink" xmlns:am3d="http://schemas.microsoft.com/office/drawing/2017/model3d" xmlns:o="urn:schemas-microsoft-com:office:office" xmlns:oel="http://schemas.microsoft.com/office/2019/extlst" xmlns:r="http://schemas.openxmlformats.org/officeDocument/2006/relationships" xmlns:m="http://schemas.openxmlformats.org/officeDocument/2006/math" xmlns:v="urn:schemas-microsoft-com:vml" xmlns:wp14="http://schemas.microsoft.com/office/word/2010/wordprocessingDrawing" xmlns:wp="http://schemas.openxmlformats.org/drawingml/2006/wordprocessingDrawing" xmlns:w10="urn:schemas-microsoft-com:office:word" xmlns:w="http://schemas.openxmlformats.org/wordprocessingml/2006/main" xmlns:w14="http://schemas.microsoft.com/office/word/2010/wordml" xmlns:w15="http://schemas.microsoft.com/office/word/2012/wordml" xmlns:w16cex="http://schemas.microsoft.com/office/word/2018/wordml/cex" xmlns:w16cid="http://schemas.microsoft.com/office/word/2016/wordml/cid" xmlns:w16="http://schemas.microsoft.com/office/word/2018/wordml" xmlns:w16du="http://schemas.microsoft.com/office/word/2023/wordml/word16du" xmlns:w16sdtdh="http://schemas.microsoft.com/office/word/2020/wordml/sdtdatahash" xmlns:w16sdtfl="http://schemas.microsoft.com/office/word/2024/wordml/sdtformatlock" xmlns:w16se="http://schemas.microsoft.com/office/word/2015/wordml/symex" xmlns:wpg="http://schemas.microsoft.com/office/word/2010/wordprocessingGroup" xmlns:wpi="http://schemas.microsoft.com/office/word/2010/wordprocessingInk" xmlns:wne="http://schemas.microsoft.com/office/word/2006/wordml" xmlns:wps="http://schemas.microsoft.com/office/word/2010/wordprocessingShape" mc:Ignorable="w14 w15 w16se w16cid w16 w16cex w16sdtdh w16sdtfl w16du wp14">
   <w:footnote w:type="separator" w:id="-1">
     <w:p>
       <w:pPr>
@@ -5817,7 +5713,7 @@
 </file>
 
 <file path=word/header1.xml><?xml version="1.0" encoding="utf-8"?>
-<w:hdr xmlns:wpc="http://schemas.microsoft.com/office/word/2010/wordprocessingCanvas" xmlns:cx="http://schemas.microsoft.com/office/drawing/2014/chartex" xmlns:cx1="http://schemas.microsoft.com/office/drawing/2015/9/8/chartex" xmlns:cx2="http://schemas.microsoft.com/office/drawing/2015/10/21/chartex" xmlns:cx3="http://schemas.microsoft.com/office/drawing/2016/5/9/chartex" xmlns:cx4="http://schemas.microsoft.com/office/drawing/2016/5/10/chartex" xmlns:cx5="http://schemas.microsoft.com/office/drawing/2016/5/11/chartex" xmlns:cx6="http://schemas.microsoft.com/office/drawing/2016/5/12/chartex" xmlns:cx7="http://schemas.microsoft.com/office/drawing/2016/5/13/chartex" xmlns:cx8="http://schemas.microsoft.com/office/drawing/2016/5/14/chartex" xmlns:mc="http://schemas.openxmlformats.org/markup-compatibility/2006" xmlns:aink="http://schemas.microsoft.com/office/drawing/2016/ink" xmlns:am3d="http://schemas.microsoft.com/office/drawing/2017/model3d" xmlns:o="urn:schemas-microsoft-com:office:office" xmlns:oel="http://schemas.microsoft.com/office/2019/extlst" xmlns:r="http://schemas.openxmlformats.org/officeDocument/2006/relationships" xmlns:m="http://schemas.openxmlformats.org/officeDocument/2006/math" xmlns:v="urn:schemas-microsoft-com:vml" xmlns:wp14="http://schemas.microsoft.com/office/word/2010/wordprocessingDrawing" xmlns:wp="http://schemas.openxmlformats.org/drawingml/2006/wordprocessingDrawing" xmlns:w10="urn:schemas-microsoft-com:office:word" xmlns:w="http://schemas.openxmlformats.org/wordprocessingml/2006/main" xmlns:w14="http://schemas.microsoft.com/office/word/2010/wordml" xmlns:w15="http://schemas.microsoft.com/office/word/2012/wordml" xmlns:w16cei="http://schemas.microsoft.com/office/word/2026/wordml/cei" xmlns:w16cex="http://schemas.microsoft.com/office/word/2018/wordml/cex" xmlns:w16cid="http://schemas.microsoft.com/office/word/2016/wordml/cid" xmlns:w16="http://schemas.microsoft.com/office/word/2018/wordml" xmlns:w16du="http://schemas.microsoft.com/office/word/2023/wordml/word16du" xmlns:w16sdtdh="http://schemas.microsoft.com/office/word/2020/wordml/sdtdatahash" xmlns:w16sdtfl="http://schemas.microsoft.com/office/word/2024/wordml/sdtformatlock" xmlns:w16se="http://schemas.microsoft.com/office/word/2015/wordml/symex" xmlns:wpg="http://schemas.microsoft.com/office/word/2010/wordprocessingGroup" xmlns:wpi="http://schemas.microsoft.com/office/word/2010/wordprocessingInk" xmlns:wne="http://schemas.microsoft.com/office/word/2006/wordml" xmlns:wps="http://schemas.microsoft.com/office/word/2010/wordprocessingShape" mc:Ignorable="w14 w15 w16se w16cid w16 w16cex w16sdtdh w16sdtfl w16du wp14">
+<w:hdr xmlns:wpc="http://schemas.microsoft.com/office/word/2010/wordprocessingCanvas" xmlns:cx="http://schemas.microsoft.com/office/drawing/2014/chartex" xmlns:cx1="http://schemas.microsoft.com/office/drawing/2015/9/8/chartex" xmlns:cx2="http://schemas.microsoft.com/office/drawing/2015/10/21/chartex" xmlns:cx3="http://schemas.microsoft.com/office/drawing/2016/5/9/chartex" xmlns:cx4="http://schemas.microsoft.com/office/drawing/2016/5/10/chartex" xmlns:cx5="http://schemas.microsoft.com/office/drawing/2016/5/11/chartex" xmlns:cx6="http://schemas.microsoft.com/office/drawing/2016/5/12/chartex" xmlns:cx7="http://schemas.microsoft.com/office/drawing/2016/5/13/chartex" xmlns:cx8="http://schemas.microsoft.com/office/drawing/2016/5/14/chartex" xmlns:mc="http://schemas.openxmlformats.org/markup-compatibility/2006" xmlns:aink="http://schemas.microsoft.com/office/drawing/2016/ink" xmlns:am3d="http://schemas.microsoft.com/office/drawing/2017/model3d" xmlns:o="urn:schemas-microsoft-com:office:office" xmlns:oel="http://schemas.microsoft.com/office/2019/extlst" xmlns:r="http://schemas.openxmlformats.org/officeDocument/2006/relationships" xmlns:m="http://schemas.openxmlformats.org/officeDocument/2006/math" xmlns:v="urn:schemas-microsoft-com:vml" xmlns:wp14="http://schemas.microsoft.com/office/word/2010/wordprocessingDrawing" xmlns:wp="http://schemas.openxmlformats.org/drawingml/2006/wordprocessingDrawing" xmlns:w10="urn:schemas-microsoft-com:office:word" xmlns:w="http://schemas.openxmlformats.org/wordprocessingml/2006/main" xmlns:w14="http://schemas.microsoft.com/office/word/2010/wordml" xmlns:w15="http://schemas.microsoft.com/office/word/2012/wordml" xmlns:w16cex="http://schemas.microsoft.com/office/word/2018/wordml/cex" xmlns:w16cid="http://schemas.microsoft.com/office/word/2016/wordml/cid" xmlns:w16="http://schemas.microsoft.com/office/word/2018/wordml" xmlns:w16du="http://schemas.microsoft.com/office/word/2023/wordml/word16du" xmlns:w16sdtdh="http://schemas.microsoft.com/office/word/2020/wordml/sdtdatahash" xmlns:w16sdtfl="http://schemas.microsoft.com/office/word/2024/wordml/sdtformatlock" xmlns:w16se="http://schemas.microsoft.com/office/word/2015/wordml/symex" xmlns:wpg="http://schemas.microsoft.com/office/word/2010/wordprocessingGroup" xmlns:wpi="http://schemas.microsoft.com/office/word/2010/wordprocessingInk" xmlns:wne="http://schemas.microsoft.com/office/word/2006/wordml" xmlns:wps="http://schemas.microsoft.com/office/word/2010/wordprocessingShape" mc:Ignorable="w14 w15 w16se w16cid w16 w16cex w16sdtdh w16sdtfl w16du wp14">
   <w:p>
     <w:pPr>
       <w:pStyle w:val="Header"/>
@@ -5838,7 +5734,7 @@
 </file>
 
 <file path=word/numbering.xml><?xml version="1.0" encoding="utf-8"?>
-<w:numbering xmlns:wpc="http://schemas.microsoft.com/office/word/2010/wordprocessingCanvas" xmlns:cx="http://schemas.microsoft.com/office/drawing/2014/chartex" xmlns:cx1="http://schemas.microsoft.com/office/drawing/2015/9/8/chartex" xmlns:cx2="http://schemas.microsoft.com/office/drawing/2015/10/21/chartex" xmlns:cx3="http://schemas.microsoft.com/office/drawing/2016/5/9/chartex" xmlns:cx4="http://schemas.microsoft.com/office/drawing/2016/5/10/chartex" xmlns:cx5="http://schemas.microsoft.com/office/drawing/2016/5/11/chartex" xmlns:cx6="http://schemas.microsoft.com/office/drawing/2016/5/12/chartex" xmlns:cx7="http://schemas.microsoft.com/office/drawing/2016/5/13/chartex" xmlns:cx8="http://schemas.microsoft.com/office/drawing/2016/5/14/chartex" xmlns:mc="http://schemas.openxmlformats.org/markup-compatibility/2006" xmlns:aink="http://schemas.microsoft.com/office/drawing/2016/ink" xmlns:am3d="http://schemas.microsoft.com/office/drawing/2017/model3d" xmlns:o="urn:schemas-microsoft-com:office:office" xmlns:oel="http://schemas.microsoft.com/office/2019/extlst" xmlns:r="http://schemas.openxmlformats.org/officeDocument/2006/relationships" xmlns:m="http://schemas.openxmlformats.org/officeDocument/2006/math" xmlns:v="urn:schemas-microsoft-com:vml" xmlns:wp14="http://schemas.microsoft.com/office/word/2010/wordprocessingDrawing" xmlns:wp="http://schemas.openxmlformats.org/drawingml/2006/wordprocessingDrawing" xmlns:w10="urn:schemas-microsoft-com:office:word" xmlns:w="http://schemas.openxmlformats.org/wordprocessingml/2006/main" xmlns:w14="http://schemas.microsoft.com/office/word/2010/wordml" xmlns:w15="http://schemas.microsoft.com/office/word/2012/wordml" xmlns:w16cei="http://schemas.microsoft.com/office/word/2026/wordml/cei" xmlns:w16cex="http://schemas.microsoft.com/office/word/2018/wordml/cex" xmlns:w16cid="http://schemas.microsoft.com/office/word/2016/wordml/cid" xmlns:w16="http://schemas.microsoft.com/office/word/2018/wordml" xmlns:w16du="http://schemas.microsoft.com/office/word/2023/wordml/word16du" xmlns:w16sdtdh="http://schemas.microsoft.com/office/word/2020/wordml/sdtdatahash" xmlns:w16sdtfl="http://schemas.microsoft.com/office/word/2024/wordml/sdtformatlock" xmlns:w16se="http://schemas.microsoft.com/office/word/2015/wordml/symex" xmlns:wpg="http://schemas.microsoft.com/office/word/2010/wordprocessingGroup" xmlns:wpi="http://schemas.microsoft.com/office/word/2010/wordprocessingInk" xmlns:wne="http://schemas.microsoft.com/office/word/2006/wordml" xmlns:wps="http://schemas.microsoft.com/office/word/2010/wordprocessingShape" mc:Ignorable="w14 w15 w16se w16cid w16 w16cex w16sdtdh w16sdtfl w16du wp14">
+<w:numbering xmlns:wpc="http://schemas.microsoft.com/office/word/2010/wordprocessingCanvas" xmlns:cx="http://schemas.microsoft.com/office/drawing/2014/chartex" xmlns:cx1="http://schemas.microsoft.com/office/drawing/2015/9/8/chartex" xmlns:cx2="http://schemas.microsoft.com/office/drawing/2015/10/21/chartex" xmlns:cx3="http://schemas.microsoft.com/office/drawing/2016/5/9/chartex" xmlns:cx4="http://schemas.microsoft.com/office/drawing/2016/5/10/chartex" xmlns:cx5="http://schemas.microsoft.com/office/drawing/2016/5/11/chartex" xmlns:cx6="http://schemas.microsoft.com/office/drawing/2016/5/12/chartex" xmlns:cx7="http://schemas.microsoft.com/office/drawing/2016/5/13/chartex" xmlns:cx8="http://schemas.microsoft.com/office/drawing/2016/5/14/chartex" xmlns:mc="http://schemas.openxmlformats.org/markup-compatibility/2006" xmlns:aink="http://schemas.microsoft.com/office/drawing/2016/ink" xmlns:am3d="http://schemas.microsoft.com/office/drawing/2017/model3d" xmlns:o="urn:schemas-microsoft-com:office:office" xmlns:oel="http://schemas.microsoft.com/office/2019/extlst" xmlns:r="http://schemas.openxmlformats.org/officeDocument/2006/relationships" xmlns:m="http://schemas.openxmlformats.org/officeDocument/2006/math" xmlns:v="urn:schemas-microsoft-com:vml" xmlns:wp14="http://schemas.microsoft.com/office/word/2010/wordprocessingDrawing" xmlns:wp="http://schemas.openxmlformats.org/drawingml/2006/wordprocessingDrawing" xmlns:w10="urn:schemas-microsoft-com:office:word" xmlns:w="http://schemas.openxmlformats.org/wordprocessingml/2006/main" xmlns:w14="http://schemas.microsoft.com/office/word/2010/wordml" xmlns:w15="http://schemas.microsoft.com/office/word/2012/wordml" xmlns:w16cex="http://schemas.microsoft.com/office/word/2018/wordml/cex" xmlns:w16cid="http://schemas.microsoft.com/office/word/2016/wordml/cid" xmlns:w16="http://schemas.microsoft.com/office/word/2018/wordml" xmlns:w16du="http://schemas.microsoft.com/office/word/2023/wordml/word16du" xmlns:w16sdtdh="http://schemas.microsoft.com/office/word/2020/wordml/sdtdatahash" xmlns:w16sdtfl="http://schemas.microsoft.com/office/word/2024/wordml/sdtformatlock" xmlns:w16se="http://schemas.microsoft.com/office/word/2015/wordml/symex" xmlns:wpg="http://schemas.microsoft.com/office/word/2010/wordprocessingGroup" xmlns:wpi="http://schemas.microsoft.com/office/word/2010/wordprocessingInk" xmlns:wne="http://schemas.microsoft.com/office/word/2006/wordml" xmlns:wps="http://schemas.microsoft.com/office/word/2010/wordprocessingShape" mc:Ignorable="w14 w15 w16se w16cid w16 w16cex w16sdtdh w16sdtfl w16du wp14">
   <w:abstractNum w:abstractNumId="0" w15:restartNumberingAfterBreak="0">
     <w:nsid w:val="063D0385"/>
     <w:multiLevelType w:val="hybridMultilevel"/>

</xml_diff>

<commit_message>
changed speed of player from 2 to 3
</commit_message>
<xml_diff>
--- a/NEA Documentation.docx
+++ b/NEA Documentation.docx
@@ -2929,7 +2929,6 @@
         <w:rPr>
           <w:rFonts w:cs="Arial"/>
         </w:rPr>
-        <w:lastRenderedPageBreak/>
         <w:t>The third party will be my brother who will be playing the game to make sure that the gam</w:t>
       </w:r>
       <w:r>
@@ -3184,6 +3183,7 @@
         <w:rPr>
           <w:rFonts w:cs="Arial"/>
         </w:rPr>
+        <w:lastRenderedPageBreak/>
         <w:t>Roullet</w:t>
       </w:r>
     </w:p>
@@ -3329,8 +3329,17 @@
           <w:b/>
           <w:bCs/>
         </w:rPr>
-        <w:t>To flip sprite :</w:t>
-      </w:r>
+        <w:t xml:space="preserve">To flip </w:t>
+      </w:r>
+      <w:proofErr w:type="gramStart"/>
+      <w:r>
+        <w:rPr>
+          <w:b/>
+          <w:bCs/>
+        </w:rPr>
+        <w:t>sprite :</w:t>
+      </w:r>
+      <w:proofErr w:type="gramEnd"/>
       <w:r>
         <w:t xml:space="preserve"> </w:t>
       </w:r>
@@ -3353,12 +3362,17 @@
         <w:t xml:space="preserve">of. </w:t>
       </w:r>
       <w:proofErr w:type="spellStart"/>
+      <w:proofErr w:type="gramStart"/>
       <w:r>
         <w:t>setScaleX</w:t>
       </w:r>
       <w:proofErr w:type="spellEnd"/>
       <w:r>
-        <w:t>() to -1 or 1 to flip the sprite when it moves left or right.</w:t>
+        <w:t>(</w:t>
+      </w:r>
+      <w:proofErr w:type="gramEnd"/>
+      <w:r>
+        <w:t>) to -1 or 1 to flip the sprite when it moves left or right.</w:t>
       </w:r>
     </w:p>
     <w:p/>
@@ -3417,7 +3431,6 @@
           <w:b/>
           <w:bCs/>
         </w:rPr>
-        <w:lastRenderedPageBreak/>
         <w:t>Link for programming blackjack game:</w:t>
       </w:r>
     </w:p>
@@ -3481,6 +3494,13 @@
     </w:p>
     <w:p/>
     <w:p>
+      <w:r>
+        <w:lastRenderedPageBreak/>
+        <w:t>Research on bounding box and collision for sprites</w:t>
+      </w:r>
+    </w:p>
+    <w:p/>
+    <w:p>
       <w:pPr>
         <w:pStyle w:val="Heading3"/>
         <w:rPr>
@@ -3710,7 +3730,27 @@
           <w:bCs/>
           <w:color w:val="auto"/>
         </w:rPr>
-        <w:t>1.6.3 Identification of objects and object–analysis diagrams</w:t>
+        <w:t xml:space="preserve">1.6.3 Identification of objects and </w:t>
+      </w:r>
+      <w:proofErr w:type="gramStart"/>
+      <w:r>
+        <w:rPr>
+          <w:rFonts w:ascii="Arial" w:hAnsi="Arial" w:cs="Arial"/>
+          <w:b/>
+          <w:bCs/>
+          <w:color w:val="auto"/>
+        </w:rPr>
+        <w:t>object</w:t>
+      </w:r>
+      <w:proofErr w:type="gramEnd"/>
+      <w:r>
+        <w:rPr>
+          <w:rFonts w:ascii="Arial" w:hAnsi="Arial" w:cs="Arial"/>
+          <w:b/>
+          <w:bCs/>
+          <w:color w:val="auto"/>
+        </w:rPr>
+        <w:t>–analysis diagrams</w:t>
       </w:r>
       <w:bookmarkEnd w:id="12"/>
       <w:r>
@@ -3990,7 +4030,11 @@
         <w:t xml:space="preserve"> and all functionality such as movement and interaction buttons</w:t>
       </w:r>
       <w:r>
-        <w:t xml:space="preserve"> are added to it. There are two separate Images for the same sprite, with one being a </w:t>
+        <w:t xml:space="preserve"> are added to it. There are two separate </w:t>
+      </w:r>
+      <w:r>
+        <w:lastRenderedPageBreak/>
+        <w:t xml:space="preserve">Images for the same sprite, with one being a </w:t>
       </w:r>
       <w:r>
         <w:t>.</w:t>
@@ -4015,7 +4059,6 @@
         <w:rPr>
           <w:noProof/>
         </w:rPr>
-        <w:lastRenderedPageBreak/>
         <w:drawing>
           <wp:inline distT="0" distB="0" distL="0" distR="0" wp14:anchorId="4FB06110" wp14:editId="226BDA2E">
             <wp:extent cx="5789295" cy="479425"/>
@@ -4143,20 +4186,30 @@
         <w:t xml:space="preserve">, which execute the functions </w:t>
       </w:r>
       <w:proofErr w:type="spellStart"/>
+      <w:proofErr w:type="gramStart"/>
       <w:r>
         <w:t>keyPressed</w:t>
       </w:r>
       <w:proofErr w:type="spellEnd"/>
       <w:r>
-        <w:t xml:space="preserve">() and </w:t>
+        <w:t>(</w:t>
+      </w:r>
+      <w:proofErr w:type="gramEnd"/>
+      <w:r>
+        <w:t xml:space="preserve">) and </w:t>
       </w:r>
       <w:proofErr w:type="spellStart"/>
+      <w:proofErr w:type="gramStart"/>
       <w:r>
         <w:t>keyReleased</w:t>
       </w:r>
       <w:proofErr w:type="spellEnd"/>
       <w:r>
-        <w:t>().</w:t>
+        <w:t>(</w:t>
+      </w:r>
+      <w:proofErr w:type="gramEnd"/>
+      <w:r>
+        <w:t>).</w:t>
       </w:r>
     </w:p>
     <w:p>
@@ -4218,31 +4271,46 @@
         <w:t xml:space="preserve">The functions </w:t>
       </w:r>
       <w:proofErr w:type="spellStart"/>
+      <w:proofErr w:type="gramStart"/>
       <w:r>
         <w:t>keyPressed</w:t>
       </w:r>
       <w:proofErr w:type="spellEnd"/>
       <w:r>
-        <w:t xml:space="preserve">() and </w:t>
+        <w:t>(</w:t>
+      </w:r>
+      <w:proofErr w:type="gramEnd"/>
+      <w:r>
+        <w:t xml:space="preserve">) and </w:t>
       </w:r>
       <w:proofErr w:type="spellStart"/>
+      <w:proofErr w:type="gramStart"/>
       <w:r>
         <w:t>keyReleased</w:t>
       </w:r>
       <w:proofErr w:type="spellEnd"/>
       <w:r>
-        <w:t>() detect which key is being released, and adjust the</w:t>
+        <w:t>(</w:t>
+      </w:r>
+      <w:proofErr w:type="gramEnd"/>
+      <w:r>
+        <w:t>) detect which key is being released, and adjust the</w:t>
       </w:r>
       <w:r>
         <w:t xml:space="preserve"> Booleans above based on </w:t>
       </w:r>
       <w:proofErr w:type="spellStart"/>
+      <w:proofErr w:type="gramStart"/>
       <w:r>
         <w:t>KeyEvent</w:t>
       </w:r>
       <w:proofErr w:type="spellEnd"/>
       <w:r>
-        <w:t>() that is passed.</w:t>
+        <w:t>(</w:t>
+      </w:r>
+      <w:proofErr w:type="gramEnd"/>
+      <w:r>
+        <w:t>) that is passed.</w:t>
       </w:r>
     </w:p>
     <w:p>
@@ -4371,12 +4439,17 @@
         <w:t xml:space="preserve"> timer I called a function called </w:t>
       </w:r>
       <w:proofErr w:type="spellStart"/>
+      <w:proofErr w:type="gramStart"/>
       <w:r>
         <w:t>updatePlayer</w:t>
       </w:r>
       <w:proofErr w:type="spellEnd"/>
       <w:r>
-        <w:t>()</w:t>
+        <w:t>(</w:t>
+      </w:r>
+      <w:proofErr w:type="gramEnd"/>
+      <w:r>
+        <w:t>)</w:t>
       </w:r>
       <w:r>
         <w:t xml:space="preserve"> (located in the player class)</w:t>
@@ -4388,20 +4461,30 @@
         <w:t xml:space="preserve">I called the function </w:t>
       </w:r>
       <w:proofErr w:type="spellStart"/>
+      <w:proofErr w:type="gramStart"/>
       <w:r>
         <w:t>movePlayer</w:t>
       </w:r>
       <w:proofErr w:type="spellEnd"/>
       <w:r>
-        <w:t xml:space="preserve">() to move the player around the map. I will also add another function in </w:t>
+        <w:t>(</w:t>
+      </w:r>
+      <w:proofErr w:type="gramEnd"/>
+      <w:r>
+        <w:t xml:space="preserve">) to move the player around the map. I will also add another function in </w:t>
       </w:r>
       <w:proofErr w:type="spellStart"/>
+      <w:proofErr w:type="gramStart"/>
       <w:r>
         <w:t>updatePlayer</w:t>
       </w:r>
       <w:proofErr w:type="spellEnd"/>
       <w:r>
-        <w:t>() for collision</w:t>
+        <w:t>(</w:t>
+      </w:r>
+      <w:proofErr w:type="gramEnd"/>
+      <w:r>
+        <w:t>) for collision</w:t>
       </w:r>
       <w:r>
         <w:t xml:space="preserve"> detection</w:t>
@@ -4574,8 +4657,9 @@
           <w:sz w:val="22"/>
           <w:szCs w:val="22"/>
         </w:rPr>
-        <w:t xml:space="preserve"> Canvas  c</w:t>
-      </w:r>
+        <w:t xml:space="preserve"> </w:t>
+      </w:r>
+      <w:proofErr w:type="gramStart"/>
       <w:r>
         <w:rPr>
           <w:rFonts w:ascii="Arial" w:hAnsi="Arial" w:cs="Arial"/>
@@ -4583,7 +4667,7 @@
           <w:sz w:val="22"/>
           <w:szCs w:val="22"/>
         </w:rPr>
-        <w:t>lass to draw this out</w:t>
+        <w:t>Canvas  c</w:t>
       </w:r>
       <w:r>
         <w:rPr>
@@ -4592,7 +4676,46 @@
           <w:sz w:val="22"/>
           <w:szCs w:val="22"/>
         </w:rPr>
-        <w:t xml:space="preserve">. First I stored a </w:t>
+        <w:t>lass</w:t>
+      </w:r>
+      <w:proofErr w:type="gramEnd"/>
+      <w:r>
+        <w:rPr>
+          <w:rFonts w:ascii="Arial" w:hAnsi="Arial" w:cs="Arial"/>
+          <w:color w:val="auto"/>
+          <w:sz w:val="22"/>
+          <w:szCs w:val="22"/>
+        </w:rPr>
+        <w:t xml:space="preserve"> to draw this out</w:t>
+      </w:r>
+      <w:r>
+        <w:rPr>
+          <w:rFonts w:ascii="Arial" w:hAnsi="Arial" w:cs="Arial"/>
+          <w:color w:val="auto"/>
+          <w:sz w:val="22"/>
+          <w:szCs w:val="22"/>
+        </w:rPr>
+        <w:t xml:space="preserve">. </w:t>
+      </w:r>
+      <w:proofErr w:type="gramStart"/>
+      <w:r>
+        <w:rPr>
+          <w:rFonts w:ascii="Arial" w:hAnsi="Arial" w:cs="Arial"/>
+          <w:color w:val="auto"/>
+          <w:sz w:val="22"/>
+          <w:szCs w:val="22"/>
+        </w:rPr>
+        <w:t>First</w:t>
+      </w:r>
+      <w:proofErr w:type="gramEnd"/>
+      <w:r>
+        <w:rPr>
+          <w:rFonts w:ascii="Arial" w:hAnsi="Arial" w:cs="Arial"/>
+          <w:color w:val="auto"/>
+          <w:sz w:val="22"/>
+          <w:szCs w:val="22"/>
+        </w:rPr>
+        <w:t xml:space="preserve"> I stored a </w:t>
       </w:r>
       <w:r>
         <w:rPr>
@@ -4724,6 +4847,7 @@
         <w:t xml:space="preserve">After this I created a function </w:t>
       </w:r>
       <w:proofErr w:type="spellStart"/>
+      <w:proofErr w:type="gramStart"/>
       <w:r>
         <w:rPr>
           <w:szCs w:val="22"/>
@@ -4735,12 +4859,19 @@
         <w:rPr>
           <w:szCs w:val="22"/>
         </w:rPr>
-        <w:t xml:space="preserve">() </w:t>
-      </w:r>
+        <w:t>(</w:t>
+      </w:r>
+      <w:proofErr w:type="gramEnd"/>
       <w:r>
         <w:rPr>
           <w:szCs w:val="22"/>
         </w:rPr>
+        <w:t xml:space="preserve">) </w:t>
+      </w:r>
+      <w:r>
+        <w:rPr>
+          <w:szCs w:val="22"/>
+        </w:rPr>
         <w:t xml:space="preserve">to render only the tiles which will be shown on the </w:t>
       </w:r>
       <w:bookmarkStart w:id="21" w:name="_Toc234311115"/>
@@ -4757,6 +4888,7 @@
         <w:t xml:space="preserve">game, with a separate function </w:t>
       </w:r>
       <w:proofErr w:type="spellStart"/>
+      <w:proofErr w:type="gramStart"/>
       <w:r>
         <w:rPr>
           <w:szCs w:val="22"/>
@@ -4768,7 +4900,14 @@
         <w:rPr>
           <w:szCs w:val="22"/>
         </w:rPr>
-        <w:t>() used to draw each individual tile using switch cases.</w:t>
+        <w:t>(</w:t>
+      </w:r>
+      <w:proofErr w:type="gramEnd"/>
+      <w:r>
+        <w:rPr>
+          <w:szCs w:val="22"/>
+        </w:rPr>
+        <w:t>) used to draw each individual tile using switch cases.</w:t>
       </w:r>
     </w:p>
     <w:p>
@@ -4822,6 +4961,7 @@
     </w:p>
     <w:p>
       <w:r>
+        <w:lastRenderedPageBreak/>
         <w:t xml:space="preserve">The canvas and graphics context are created </w:t>
       </w:r>
       <w:r>
@@ -4833,7 +4973,6 @@
         <w:rPr>
           <w:noProof/>
         </w:rPr>
-        <w:lastRenderedPageBreak/>
         <w:drawing>
           <wp:inline distT="0" distB="0" distL="0" distR="0" wp14:anchorId="12470157" wp14:editId="6D69CCFA">
             <wp:extent cx="4353533" cy="2381582"/>
@@ -4976,10 +5115,12 @@
         <w:t xml:space="preserve"> and </w:t>
       </w:r>
       <w:proofErr w:type="spellStart"/>
+      <w:proofErr w:type="gramStart"/>
       <w:r>
         <w:t>player.y</w:t>
       </w:r>
       <w:proofErr w:type="spellEnd"/>
+      <w:proofErr w:type="gramEnd"/>
       <w:r>
         <w:t xml:space="preserve"> to </w:t>
       </w:r>
@@ -5007,6 +5148,7 @@
       </w:r>
       <w:proofErr w:type="spellStart"/>
       <w:r>
+        <w:lastRenderedPageBreak/>
         <w:t>tilemap</w:t>
       </w:r>
       <w:proofErr w:type="spellEnd"/>
@@ -5072,11 +5214,7 @@
         <w:t>To do this I first c</w:t>
       </w:r>
       <w:r>
-        <w:t xml:space="preserve">reated a camera in the game class which is calculated based on the sprite’s position relative to the map (at half the stages dimensions). Then I adjusted the rendering </w:t>
-      </w:r>
-      <w:r>
-        <w:lastRenderedPageBreak/>
-        <w:t>function in the background class to draw the map from the appropriate starting coordinates given by the camera. The player’s position is then updated relative to the camera and stage.</w:t>
+        <w:t>reated a camera in the game class which is calculated based on the sprite’s position relative to the map (at half the stages dimensions). Then I adjusted the rendering function in the background class to draw the map from the appropriate starting coordinates given by the camera. The player’s position is then updated relative to the camera and stage.</w:t>
       </w:r>
     </w:p>
     <w:p>
@@ -5085,7 +5223,7 @@
           <w:noProof/>
         </w:rPr>
         <w:drawing>
-          <wp:inline distT="0" distB="0" distL="0" distR="0" wp14:anchorId="226F89C5" wp14:editId="274337F2">
+          <wp:inline distT="0" distB="0" distL="0" distR="0" wp14:anchorId="226F89C5" wp14:editId="42D847B1">
             <wp:extent cx="5789295" cy="1595120"/>
             <wp:effectExtent l="0" t="0" r="1905" b="5080"/>
             <wp:docPr id="542006062" name="Picture 3"/>
@@ -5193,6 +5331,7 @@
     </w:p>
     <w:p>
       <w:r>
+        <w:lastRenderedPageBreak/>
         <w:t>The first part of collision detection was to check if the sprite collided with a wall. This was done by checking to see if the sprite overlapped with any tiles that had a value of 1, representing a wall.</w:t>
       </w:r>
       <w:r>
@@ -5205,7 +5344,7 @@
           <w:noProof/>
         </w:rPr>
         <w:drawing>
-          <wp:inline distT="0" distB="0" distL="0" distR="0" wp14:anchorId="1A9EABE6" wp14:editId="5F7F072D">
+          <wp:inline distT="0" distB="0" distL="0" distR="0" wp14:anchorId="1A9EABE6" wp14:editId="07863628">
             <wp:extent cx="5789295" cy="1915795"/>
             <wp:effectExtent l="0" t="0" r="1905" b="8255"/>
             <wp:docPr id="184673664" name="Picture 3"/>
@@ -5264,8 +5403,15 @@
     </w:p>
     <w:p>
       <w:r>
-        <w:lastRenderedPageBreak/>
-        <w:t xml:space="preserve">At this time I </w:t>
+        <w:t xml:space="preserve">At this </w:t>
+      </w:r>
+      <w:proofErr w:type="gramStart"/>
+      <w:r>
+        <w:t>time</w:t>
+      </w:r>
+      <w:proofErr w:type="gramEnd"/>
+      <w:r>
+        <w:t xml:space="preserve"> I </w:t>
       </w:r>
       <w:r>
         <w:t xml:space="preserve">also </w:t>
@@ -5324,12 +5470,342 @@
     </w:p>
     <w:p/>
     <w:p>
+      <w:pPr>
+        <w:rPr>
+          <w:b/>
+          <w:bCs/>
+        </w:rPr>
+      </w:pPr>
+      <w:r>
+        <w:rPr>
+          <w:b/>
+          <w:bCs/>
+        </w:rPr>
+        <w:t>Creating parent classes for table sprites and the games</w:t>
+      </w:r>
+    </w:p>
+    <w:p>
+      <w:r>
+        <w:t>Now I began creating two separate classes: one for the game to be played and one for the sprite that would be shown for its table.</w:t>
+      </w:r>
+    </w:p>
+    <w:p>
+      <w:r>
+        <w:rPr>
+          <w:noProof/>
+        </w:rPr>
+        <w:drawing>
+          <wp:inline distT="0" distB="0" distL="0" distR="0" wp14:anchorId="4B0D6A25" wp14:editId="11F08E50">
+            <wp:extent cx="5789295" cy="3827145"/>
+            <wp:effectExtent l="0" t="0" r="1905" b="1905"/>
+            <wp:docPr id="111953157" name="Picture 3"/>
+            <wp:cNvGraphicFramePr>
+              <a:graphicFrameLocks xmlns:a="http://schemas.openxmlformats.org/drawingml/2006/main" noChangeAspect="1"/>
+            </wp:cNvGraphicFramePr>
+            <a:graphic xmlns:a="http://schemas.openxmlformats.org/drawingml/2006/main">
+              <a:graphicData uri="http://schemas.openxmlformats.org/drawingml/2006/picture">
+                <pic:pic xmlns:pic="http://schemas.openxmlformats.org/drawingml/2006/picture">
+                  <pic:nvPicPr>
+                    <pic:cNvPr id="111953157" name="Picture 111953157"/>
+                    <pic:cNvPicPr/>
+                  </pic:nvPicPr>
+                  <pic:blipFill>
+                    <a:blip r:embed="rId27">
+                      <a:extLst>
+                        <a:ext uri="{28A0092B-C50C-407E-A947-70E740481C1C}">
+                          <a14:useLocalDpi xmlns:a14="http://schemas.microsoft.com/office/drawing/2010/main" val="0"/>
+                        </a:ext>
+                      </a:extLst>
+                    </a:blip>
+                    <a:stretch>
+                      <a:fillRect/>
+                    </a:stretch>
+                  </pic:blipFill>
+                  <pic:spPr>
+                    <a:xfrm>
+                      <a:off x="0" y="0"/>
+                      <a:ext cx="5789295" cy="3827145"/>
+                    </a:xfrm>
+                    <a:prstGeom prst="rect">
+                      <a:avLst/>
+                    </a:prstGeom>
+                  </pic:spPr>
+                </pic:pic>
+              </a:graphicData>
+            </a:graphic>
+          </wp:inline>
+        </w:drawing>
+      </w:r>
+    </w:p>
+    <w:p>
+      <w:r>
+        <w:lastRenderedPageBreak/>
+        <w:t xml:space="preserve">This class takes the image of each table and its positions on the map, to display it. </w:t>
+      </w:r>
+    </w:p>
+    <w:p/>
+    <w:p>
+      <w:r>
+        <w:rPr>
+          <w:noProof/>
+        </w:rPr>
+        <w:drawing>
+          <wp:inline distT="0" distB="0" distL="0" distR="0" wp14:anchorId="481519C9" wp14:editId="0B580385">
+            <wp:extent cx="5789295" cy="5154930"/>
+            <wp:effectExtent l="0" t="0" r="1905" b="7620"/>
+            <wp:docPr id="1400482668" name="Picture 5"/>
+            <wp:cNvGraphicFramePr>
+              <a:graphicFrameLocks xmlns:a="http://schemas.openxmlformats.org/drawingml/2006/main" noChangeAspect="1"/>
+            </wp:cNvGraphicFramePr>
+            <a:graphic xmlns:a="http://schemas.openxmlformats.org/drawingml/2006/main">
+              <a:graphicData uri="http://schemas.openxmlformats.org/drawingml/2006/picture">
+                <pic:pic xmlns:pic="http://schemas.openxmlformats.org/drawingml/2006/picture">
+                  <pic:nvPicPr>
+                    <pic:cNvPr id="1400482668" name="Picture 1400482668"/>
+                    <pic:cNvPicPr/>
+                  </pic:nvPicPr>
+                  <pic:blipFill>
+                    <a:blip r:embed="rId28">
+                      <a:extLst>
+                        <a:ext uri="{28A0092B-C50C-407E-A947-70E740481C1C}">
+                          <a14:useLocalDpi xmlns:a14="http://schemas.microsoft.com/office/drawing/2010/main" val="0"/>
+                        </a:ext>
+                      </a:extLst>
+                    </a:blip>
+                    <a:stretch>
+                      <a:fillRect/>
+                    </a:stretch>
+                  </pic:blipFill>
+                  <pic:spPr>
+                    <a:xfrm>
+                      <a:off x="0" y="0"/>
+                      <a:ext cx="5789295" cy="5154930"/>
+                    </a:xfrm>
+                    <a:prstGeom prst="rect">
+                      <a:avLst/>
+                    </a:prstGeom>
+                  </pic:spPr>
+                </pic:pic>
+              </a:graphicData>
+            </a:graphic>
+          </wp:inline>
+        </w:drawing>
+      </w:r>
+    </w:p>
+    <w:p>
+      <w:r>
+        <w:t xml:space="preserve">This class is controls the scene that the application switches to when the selected game is being played. The method </w:t>
+      </w:r>
+      <w:proofErr w:type="spellStart"/>
+      <w:proofErr w:type="gramStart"/>
+      <w:r>
+        <w:t>playGame</w:t>
+      </w:r>
+      <w:proofErr w:type="spellEnd"/>
+      <w:r>
+        <w:t>(</w:t>
+      </w:r>
+      <w:proofErr w:type="gramEnd"/>
+      <w:r>
+        <w:t xml:space="preserve">) will be different for each game, except </w:t>
+      </w:r>
+      <w:proofErr w:type="spellStart"/>
+      <w:r>
+        <w:t>fot</w:t>
+      </w:r>
+      <w:proofErr w:type="spellEnd"/>
       <w:r>
         <w:t xml:space="preserve"> </w:t>
       </w:r>
+      <w:proofErr w:type="gramStart"/>
+      <w:r>
+        <w:t>the .clear</w:t>
+      </w:r>
+      <w:proofErr w:type="gramEnd"/>
+      <w:r>
+        <w:t>(), which removes everything on the screen.</w:t>
+      </w:r>
+    </w:p>
+    <w:p>
+      <w:r>
+        <w:t xml:space="preserve">In the casino class I created the objects and added the tables to an array </w:t>
+      </w:r>
+      <w:proofErr w:type="gramStart"/>
+      <w:r>
+        <w:t>in order to</w:t>
+      </w:r>
+      <w:proofErr w:type="gramEnd"/>
+      <w:r>
+        <w:t xml:space="preserve"> manage collision detection.</w:t>
+      </w:r>
+    </w:p>
+    <w:p>
+      <w:r>
+        <w:rPr>
+          <w:noProof/>
+        </w:rPr>
+        <w:drawing>
+          <wp:inline distT="0" distB="0" distL="0" distR="0" wp14:anchorId="6825EA17" wp14:editId="60D286B2">
+            <wp:extent cx="5789295" cy="909320"/>
+            <wp:effectExtent l="0" t="0" r="1905" b="5080"/>
+            <wp:docPr id="910023920" name="Picture 6"/>
+            <wp:cNvGraphicFramePr>
+              <a:graphicFrameLocks xmlns:a="http://schemas.openxmlformats.org/drawingml/2006/main" noChangeAspect="1"/>
+            </wp:cNvGraphicFramePr>
+            <a:graphic xmlns:a="http://schemas.openxmlformats.org/drawingml/2006/main">
+              <a:graphicData uri="http://schemas.openxmlformats.org/drawingml/2006/picture">
+                <pic:pic xmlns:pic="http://schemas.openxmlformats.org/drawingml/2006/picture">
+                  <pic:nvPicPr>
+                    <pic:cNvPr id="910023920" name="Picture 910023920"/>
+                    <pic:cNvPicPr/>
+                  </pic:nvPicPr>
+                  <pic:blipFill>
+                    <a:blip r:embed="rId29" cstate="print">
+                      <a:extLst>
+                        <a:ext uri="{28A0092B-C50C-407E-A947-70E740481C1C}">
+                          <a14:useLocalDpi xmlns:a14="http://schemas.microsoft.com/office/drawing/2010/main" val="0"/>
+                        </a:ext>
+                      </a:extLst>
+                    </a:blip>
+                    <a:stretch>
+                      <a:fillRect/>
+                    </a:stretch>
+                  </pic:blipFill>
+                  <pic:spPr>
+                    <a:xfrm>
+                      <a:off x="0" y="0"/>
+                      <a:ext cx="5789295" cy="909320"/>
+                    </a:xfrm>
+                    <a:prstGeom prst="rect">
+                      <a:avLst/>
+                    </a:prstGeom>
+                  </pic:spPr>
+                </pic:pic>
+              </a:graphicData>
+            </a:graphic>
+          </wp:inline>
+        </w:drawing>
+      </w:r>
     </w:p>
     <w:p/>
     <w:p>
+      <w:r>
+        <w:t xml:space="preserve">After this I added to the collision detection method in the player class so that collisions with each table </w:t>
+      </w:r>
+      <w:proofErr w:type="gramStart"/>
+      <w:r>
+        <w:t>where</w:t>
+      </w:r>
+      <w:proofErr w:type="gramEnd"/>
+      <w:r>
+        <w:t xml:space="preserve"> reacted to.</w:t>
+      </w:r>
+    </w:p>
+    <w:p>
+      <w:r>
+        <w:rPr>
+          <w:noProof/>
+        </w:rPr>
+        <w:lastRenderedPageBreak/>
+        <w:drawing>
+          <wp:inline distT="0" distB="0" distL="0" distR="0" wp14:anchorId="1DE1C238" wp14:editId="77E566FA">
+            <wp:extent cx="5334462" cy="4938188"/>
+            <wp:effectExtent l="0" t="0" r="0" b="0"/>
+            <wp:docPr id="1175028967" name="Picture 7"/>
+            <wp:cNvGraphicFramePr>
+              <a:graphicFrameLocks xmlns:a="http://schemas.openxmlformats.org/drawingml/2006/main" noChangeAspect="1"/>
+            </wp:cNvGraphicFramePr>
+            <a:graphic xmlns:a="http://schemas.openxmlformats.org/drawingml/2006/main">
+              <a:graphicData uri="http://schemas.openxmlformats.org/drawingml/2006/picture">
+                <pic:pic xmlns:pic="http://schemas.openxmlformats.org/drawingml/2006/picture">
+                  <pic:nvPicPr>
+                    <pic:cNvPr id="1175028967" name="Picture 1175028967"/>
+                    <pic:cNvPicPr/>
+                  </pic:nvPicPr>
+                  <pic:blipFill>
+                    <a:blip r:embed="rId30">
+                      <a:extLst>
+                        <a:ext uri="{28A0092B-C50C-407E-A947-70E740481C1C}">
+                          <a14:useLocalDpi xmlns:a14="http://schemas.microsoft.com/office/drawing/2010/main" val="0"/>
+                        </a:ext>
+                      </a:extLst>
+                    </a:blip>
+                    <a:stretch>
+                      <a:fillRect/>
+                    </a:stretch>
+                  </pic:blipFill>
+                  <pic:spPr>
+                    <a:xfrm>
+                      <a:off x="0" y="0"/>
+                      <a:ext cx="5334462" cy="4938188"/>
+                    </a:xfrm>
+                    <a:prstGeom prst="rect">
+                      <a:avLst/>
+                    </a:prstGeom>
+                  </pic:spPr>
+                </pic:pic>
+              </a:graphicData>
+            </a:graphic>
+          </wp:inline>
+        </w:drawing>
+      </w:r>
+    </w:p>
+    <w:p>
+      <w:r>
+        <w:t xml:space="preserve">The </w:t>
+      </w:r>
+      <w:proofErr w:type="spellStart"/>
+      <w:r>
+        <w:t>activated_table</w:t>
+      </w:r>
+      <w:proofErr w:type="spellEnd"/>
+      <w:r>
+        <w:t xml:space="preserve"> variable stores the last table that the player collided with to manage the pop-up which allows the user to interact with the table and play the game. It links to a method which calculates the distance between the player and table and changes a variable </w:t>
+      </w:r>
+      <w:proofErr w:type="spellStart"/>
+      <w:r>
+        <w:t>is_interacting</w:t>
+      </w:r>
+      <w:proofErr w:type="spellEnd"/>
+      <w:r>
+        <w:t xml:space="preserve"> in the Casino class which displays the pop-up.</w:t>
+      </w:r>
+    </w:p>
+    <w:p>
+      <w:r>
+        <w:t xml:space="preserve"> </w:t>
+      </w:r>
+      <w:r>
+        <w:t>Add Tables Class</w:t>
+      </w:r>
+    </w:p>
+    <w:p>
+      <w:r>
+        <w:t>Add Games parent class</w:t>
+      </w:r>
+    </w:p>
+    <w:p>
+      <w:r>
+        <w:t>Table activation and interact logo pop up</w:t>
+      </w:r>
+    </w:p>
+    <w:p>
+      <w:r>
+        <w:t>Collision between sprites</w:t>
+      </w:r>
+    </w:p>
+    <w:p>
+      <w:r>
+        <w:t>Card generation</w:t>
+      </w:r>
+    </w:p>
+    <w:p>
+      <w:r>
+        <w:t>Card class</w:t>
+      </w:r>
+    </w:p>
+    <w:p/>
+    <w:p>
       <w:pPr>
         <w:rPr>
           <w:rFonts w:cs="Arial"/>
@@ -5585,8 +6061,8 @@
       </w:pPr>
     </w:p>
     <w:sectPr>
-      <w:headerReference w:type="default" r:id="rId27"/>
-      <w:footerReference w:type="default" r:id="rId28"/>
+      <w:headerReference w:type="default" r:id="rId31"/>
+      <w:footerReference w:type="default" r:id="rId32"/>
       <w:footnotePr>
         <w:pos w:val="beneathText"/>
       </w:footnotePr>

</xml_diff>